<commit_message>
band-advance: fix Consoles losing its Mon line in the universal template
The blank-out pass for PA/Consoles used set_cell(), which collapses a
cell down to one paragraph — harmless for PA (always one line) but wrong
for Consoles, which is FOH/Mon on two lines like Engineer. Real filed
docs migrated into this template were silently dropping the Mon –
console assignment. Fixed to clear each paragraph in place instead.

Co-Authored-By: Claude Sonnet 5 <noreply@anthropic.com>
</commit_message>
<xml_diff>
--- a/Code/BandInfoForm/tools/doc_templates/3CDC Universal Show Advance.docx
+++ b/Code/BandInfoForm/tools/doc_templates/3CDC Universal Show Advance.docx
@@ -2449,46 +2449,94 @@
                     </w:rPr>
                   </w:r>
                 </w:p>
-              </w:tc>
-              <w:tc>
-                <w:tcPr>
-                  <w:tcW w:type="dxa" w:w="1850"/>
-                  <w:tcMar>
-                    <w:top w:type="dxa" w:w="40"/>
-                    <w:left w:type="dxa" w:w="80"/>
-                    <w:bottom w:type="dxa" w:w="40"/>
-                    <w:right w:type="dxa" w:w="80"/>
-                  </w:tcMar>
-                  <w:vAlign w:val="top"/>
-                </w:tcPr>
-                <w:p>
-                  <w:pPr>
-                    <w:spacing w:after="40"/>
-                  </w:pPr>
-                  <w:r>
-                    <w:rPr>
-                      <w:rFonts w:ascii="Times New Roman" w:cs="Times New Roman" w:eastAsia="Times New Roman" w:hAnsi="Times New Roman"/>
-                      <w:b w:val="false"/>
-                      <w:bCs w:val="false"/>
-                      <w:i w:val="false"/>
-                      <w:iCs w:val="false"/>
-                      <w:sz w:val="20"/>
-                      <w:szCs w:val="20"/>
-                    </w:rPr>
-                  </w:r>
-                </w:p>
-              </w:tc>
-              <w:tc>
-                <w:tcPr>
-                  <w:tcW w:type="dxa" w:w="1850"/>
-                  <w:tcMar>
-                    <w:top w:type="dxa" w:w="40"/>
-                    <w:left w:type="dxa" w:w="80"/>
-                    <w:bottom w:type="dxa" w:w="40"/>
-                    <w:right w:type="dxa" w:w="80"/>
-                  </w:tcMar>
-                  <w:vAlign w:val="top"/>
-                </w:tcPr>
+                <w:p>
+                  <w:pPr>
+                    <w:spacing w:after="40"/>
+                  </w:pPr>
+                  <w:r>
+                    <w:rPr>
+                      <w:rFonts w:ascii="Times New Roman" w:cs="Times New Roman" w:eastAsia="Times New Roman" w:hAnsi="Times New Roman"/>
+                      <w:b w:val="false"/>
+                      <w:bCs w:val="false"/>
+                      <w:i w:val="false"/>
+                      <w:iCs w:val="false"/>
+                      <w:sz w:val="20"/>
+                      <w:szCs w:val="20"/>
+                    </w:rPr>
+                  </w:r>
+                </w:p>
+              </w:tc>
+              <w:tc>
+                <w:tcPr>
+                  <w:tcW w:type="dxa" w:w="1850"/>
+                  <w:tcMar>
+                    <w:top w:type="dxa" w:w="40"/>
+                    <w:left w:type="dxa" w:w="80"/>
+                    <w:bottom w:type="dxa" w:w="40"/>
+                    <w:right w:type="dxa" w:w="80"/>
+                  </w:tcMar>
+                  <w:vAlign w:val="top"/>
+                </w:tcPr>
+                <w:p>
+                  <w:pPr>
+                    <w:spacing w:after="40"/>
+                  </w:pPr>
+                  <w:r>
+                    <w:rPr>
+                      <w:rFonts w:ascii="Times New Roman" w:cs="Times New Roman" w:eastAsia="Times New Roman" w:hAnsi="Times New Roman"/>
+                      <w:b w:val="false"/>
+                      <w:bCs w:val="false"/>
+                      <w:i w:val="false"/>
+                      <w:iCs w:val="false"/>
+                      <w:sz w:val="20"/>
+                      <w:szCs w:val="20"/>
+                    </w:rPr>
+                  </w:r>
+                </w:p>
+                <w:p>
+                  <w:pPr>
+                    <w:spacing w:after="40"/>
+                  </w:pPr>
+                  <w:r>
+                    <w:rPr>
+                      <w:rFonts w:ascii="Times New Roman" w:cs="Times New Roman" w:eastAsia="Times New Roman" w:hAnsi="Times New Roman"/>
+                      <w:b w:val="false"/>
+                      <w:bCs w:val="false"/>
+                      <w:i w:val="false"/>
+                      <w:iCs w:val="false"/>
+                      <w:sz w:val="20"/>
+                      <w:szCs w:val="20"/>
+                    </w:rPr>
+                  </w:r>
+                </w:p>
+              </w:tc>
+              <w:tc>
+                <w:tcPr>
+                  <w:tcW w:type="dxa" w:w="1850"/>
+                  <w:tcMar>
+                    <w:top w:type="dxa" w:w="40"/>
+                    <w:left w:type="dxa" w:w="80"/>
+                    <w:bottom w:type="dxa" w:w="40"/>
+                    <w:right w:type="dxa" w:w="80"/>
+                  </w:tcMar>
+                  <w:vAlign w:val="top"/>
+                </w:tcPr>
+                <w:p>
+                  <w:pPr>
+                    <w:spacing w:after="40"/>
+                  </w:pPr>
+                  <w:r>
+                    <w:rPr>
+                      <w:rFonts w:ascii="Times New Roman" w:cs="Times New Roman" w:eastAsia="Times New Roman" w:hAnsi="Times New Roman"/>
+                      <w:b w:val="false"/>
+                      <w:bCs w:val="false"/>
+                      <w:i w:val="false"/>
+                      <w:iCs w:val="false"/>
+                      <w:sz w:val="20"/>
+                      <w:szCs w:val="20"/>
+                    </w:rPr>
+                  </w:r>
+                </w:p>
                 <w:p>
                   <w:pPr>
                     <w:spacing w:after="40"/>

</xml_diff>

<commit_message>
band-advance: dedicated Number of IEMs / Number of Performers rows on the universal template
Number of IEMs was previously only a Yes/No checkbox with the count
buried in Input Notes text; Number of Performers had no row at all and
was silently piggybacking on Drink Tix. Both now get their own visible
area on the filled document, populated from the same iem_count/performers
form fields. Drink Tix goes back to being genuinely blank for staff to
fill in by hand.

Cloned the new rows from Monitors' plain-text shape rather than IEMs'
checkbox shape, so no orphaned <w:sdt> content controls ride along.
Verified against a real live event (Tailgate, FSQ 9/13) — performers
count landed correctly in the new row; iem_count came back blank since
no real band has answered that question yet (added to form.html this
session).

Co-Authored-By: Claude Sonnet 5 <noreply@anthropic.com>
</commit_message>
<xml_diff>
--- a/Code/BandInfoForm/tools/doc_templates/3CDC Universal Show Advance.docx
+++ b/Code/BandInfoForm/tools/doc_templates/3CDC Universal Show Advance.docx
@@ -2931,6 +2931,122 @@
                       <w:sz w:val="20"/>
                       <w:szCs w:val="20"/>
                     </w:rPr>
+                    <w:t>Number of IEMs</w:t>
+                  </w:r>
+                </w:p>
+              </w:tc>
+              <w:tc>
+                <w:tcPr>
+                  <w:tcW w:type="dxa" w:w="1850"/>
+                  <w:tcMar>
+                    <w:top w:type="dxa" w:w="40"/>
+                    <w:left w:type="dxa" w:w="80"/>
+                    <w:bottom w:type="dxa" w:w="40"/>
+                    <w:right w:type="dxa" w:w="80"/>
+                  </w:tcMar>
+                  <w:vAlign w:val="top"/>
+                </w:tcPr>
+                <w:p>
+                  <w:pPr>
+                    <w:spacing w:after="40"/>
+                  </w:pPr>
+                  <w:r>
+                    <w:rPr>
+                      <w:rFonts w:ascii="Calibri" w:cs="Calibri" w:eastAsia="Times New Roman" w:hAnsi="Calibri"/>
+                      <w:b w:val="false"/>
+                      <w:bCs w:val="false"/>
+                      <w:i w:val="false"/>
+                      <w:iCs w:val="false"/>
+                      <w:sz w:val="20"/>
+                      <w:szCs w:val="20"/>
+                    </w:rPr>
+                  </w:r>
+                </w:p>
+              </w:tc>
+              <w:tc>
+                <w:tcPr>
+                  <w:tcW w:type="dxa" w:w="1850"/>
+                  <w:tcMar>
+                    <w:top w:type="dxa" w:w="40"/>
+                    <w:left w:type="dxa" w:w="80"/>
+                    <w:bottom w:type="dxa" w:w="40"/>
+                    <w:right w:type="dxa" w:w="80"/>
+                  </w:tcMar>
+                  <w:vAlign w:val="top"/>
+                </w:tcPr>
+                <w:p>
+                  <w:pPr>
+                    <w:spacing w:after="40"/>
+                  </w:pPr>
+                  <w:r>
+                    <w:rPr>
+                      <w:rFonts w:ascii="Calibri" w:cs="Calibri" w:eastAsia="Times New Roman" w:hAnsi="Calibri"/>
+                      <w:b w:val="false"/>
+                      <w:bCs w:val="false"/>
+                      <w:i w:val="false"/>
+                      <w:iCs w:val="false"/>
+                      <w:sz w:val="20"/>
+                      <w:szCs w:val="20"/>
+                    </w:rPr>
+                  </w:r>
+                </w:p>
+              </w:tc>
+              <w:tc>
+                <w:tcPr>
+                  <w:tcW w:type="dxa" w:w="1850"/>
+                  <w:tcMar>
+                    <w:top w:type="dxa" w:w="40"/>
+                    <w:left w:type="dxa" w:w="80"/>
+                    <w:bottom w:type="dxa" w:w="40"/>
+                    <w:right w:type="dxa" w:w="80"/>
+                  </w:tcMar>
+                  <w:vAlign w:val="top"/>
+                </w:tcPr>
+                <w:p>
+                  <w:pPr>
+                    <w:spacing w:after="40"/>
+                  </w:pPr>
+                  <w:r>
+                    <w:rPr>
+                      <w:rFonts w:ascii="Calibri" w:cs="Calibri" w:eastAsia="Times New Roman" w:hAnsi="Calibri"/>
+                      <w:b w:val="false"/>
+                      <w:bCs w:val="false"/>
+                      <w:i w:val="false"/>
+                      <w:iCs w:val="false"/>
+                      <w:sz w:val="20"/>
+                      <w:szCs w:val="20"/>
+                    </w:rPr>
+                  </w:r>
+                </w:p>
+              </w:tc>
+            </w:tr>
+            <w:tr>
+              <w:tc>
+                <w:tcPr>
+                  <w:tcW w:type="dxa" w:w="1750"/>
+                  <w:tcMar>
+                    <w:top w:type="dxa" w:w="40"/>
+                    <w:left w:type="dxa" w:w="80"/>
+                    <w:bottom w:type="dxa" w:w="40"/>
+                    <w:right w:type="dxa" w:w="80"/>
+                  </w:tcMar>
+                  <w:vAlign w:val="top"/>
+                </w:tcPr>
+                <w:p>
+                  <w:pPr>
+                    <w:spacing w:after="40"/>
+                    <w:jc w:val="right"/>
+                  </w:pPr>
+                  <w:r>
+                    <w:rPr>
+                      <w:rFonts w:ascii="Calibri" w:cs="Calibri" w:eastAsia="Times New Roman" w:hAnsi="Calibri"/>
+                      <w:b/>
+                      <w:bCs/>
+                      <w:i w:val="false"/>
+                      <w:iCs w:val="false"/>
+                      <w:sz w:val="20"/>
+                      <w:szCs w:val="20"/>
+                    </w:rPr>
                     <w:t xml:space="preserve">Input Notes</w:t>
                   </w:r>
                 </w:p>
@@ -4143,6 +4259,122 @@
                       <w:szCs w:val="20"/>
                     </w:rPr>
                     <w:t xml:space="preserve"/>
+                  </w:r>
+                </w:p>
+              </w:tc>
+            </w:tr>
+            <w:tr>
+              <w:tc>
+                <w:tcPr>
+                  <w:tcW w:type="dxa" w:w="1750"/>
+                  <w:tcMar>
+                    <w:top w:type="dxa" w:w="40"/>
+                    <w:left w:type="dxa" w:w="80"/>
+                    <w:bottom w:type="dxa" w:w="40"/>
+                    <w:right w:type="dxa" w:w="80"/>
+                  </w:tcMar>
+                  <w:vAlign w:val="top"/>
+                </w:tcPr>
+                <w:p>
+                  <w:pPr>
+                    <w:spacing w:after="40"/>
+                    <w:jc w:val="right"/>
+                  </w:pPr>
+                  <w:r>
+                    <w:rPr>
+                      <w:rFonts w:ascii="Calibri" w:cs="Calibri" w:eastAsia="Times New Roman" w:hAnsi="Calibri"/>
+                      <w:b/>
+                      <w:bCs/>
+                      <w:i w:val="false"/>
+                      <w:iCs w:val="false"/>
+                      <w:sz w:val="20"/>
+                      <w:szCs w:val="20"/>
+                    </w:rPr>
+                    <w:t>Number of Performers</w:t>
+                  </w:r>
+                </w:p>
+              </w:tc>
+              <w:tc>
+                <w:tcPr>
+                  <w:tcW w:type="dxa" w:w="1850"/>
+                  <w:tcMar>
+                    <w:top w:type="dxa" w:w="40"/>
+                    <w:left w:type="dxa" w:w="80"/>
+                    <w:bottom w:type="dxa" w:w="40"/>
+                    <w:right w:type="dxa" w:w="80"/>
+                  </w:tcMar>
+                  <w:vAlign w:val="top"/>
+                </w:tcPr>
+                <w:p>
+                  <w:pPr>
+                    <w:spacing w:after="40"/>
+                  </w:pPr>
+                  <w:r>
+                    <w:rPr>
+                      <w:rFonts w:ascii="Calibri" w:cs="Calibri" w:eastAsia="Times New Roman" w:hAnsi="Calibri"/>
+                      <w:b w:val="false"/>
+                      <w:bCs w:val="false"/>
+                      <w:i w:val="false"/>
+                      <w:iCs w:val="false"/>
+                      <w:sz w:val="20"/>
+                      <w:szCs w:val="20"/>
+                    </w:rPr>
+                  </w:r>
+                </w:p>
+              </w:tc>
+              <w:tc>
+                <w:tcPr>
+                  <w:tcW w:type="dxa" w:w="1850"/>
+                  <w:tcMar>
+                    <w:top w:type="dxa" w:w="40"/>
+                    <w:left w:type="dxa" w:w="80"/>
+                    <w:bottom w:type="dxa" w:w="40"/>
+                    <w:right w:type="dxa" w:w="80"/>
+                  </w:tcMar>
+                  <w:vAlign w:val="top"/>
+                </w:tcPr>
+                <w:p>
+                  <w:pPr>
+                    <w:spacing w:after="40"/>
+                  </w:pPr>
+                  <w:r>
+                    <w:rPr>
+                      <w:rFonts w:ascii="Calibri" w:cs="Calibri" w:eastAsia="Times New Roman" w:hAnsi="Calibri"/>
+                      <w:b w:val="false"/>
+                      <w:bCs w:val="false"/>
+                      <w:i w:val="false"/>
+                      <w:iCs w:val="false"/>
+                      <w:sz w:val="20"/>
+                      <w:szCs w:val="20"/>
+                    </w:rPr>
+                  </w:r>
+                </w:p>
+              </w:tc>
+              <w:tc>
+                <w:tcPr>
+                  <w:tcW w:type="dxa" w:w="1850"/>
+                  <w:tcMar>
+                    <w:top w:type="dxa" w:w="40"/>
+                    <w:left w:type="dxa" w:w="80"/>
+                    <w:bottom w:type="dxa" w:w="40"/>
+                    <w:right w:type="dxa" w:w="80"/>
+                  </w:tcMar>
+                  <w:vAlign w:val="top"/>
+                </w:tcPr>
+                <w:p>
+                  <w:pPr>
+                    <w:spacing w:after="40"/>
+                  </w:pPr>
+                  <w:r>
+                    <w:rPr>
+                      <w:rFonts w:ascii="Calibri" w:cs="Calibri" w:eastAsia="Times New Roman" w:hAnsi="Calibri"/>
+                      <w:b w:val="false"/>
+                      <w:bCs w:val="false"/>
+                      <w:i w:val="false"/>
+                      <w:iCs w:val="false"/>
+                      <w:sz w:val="20"/>
+                      <w:szCs w:val="20"/>
+                    </w:rPr>
                   </w:r>
                 </w:p>
               </w:tc>

</xml_diff>

<commit_message>
band-advance: dedicated Lighting Notes row; fix stage plot link regression
Lighting Notes was folded into the shared Input Notes text — give it its
own row on the universal template, right after Scenic Notes, same pattern
as the IEM/performer count rows added earlier today.

Also root-caused the stage plot link going back to plain text: fill()
only makes it a real hyperlink when a stageplot_names mapping is passed
in (built by package_run.py from the uploaded file), and my own ad hoc
daysheet.fill() calls today for The Closers left that out, silently
falling back to '(file on record)' text. Not a code regression -
package_run.py's real pipeline was never touched. Re-filed The Closers'
day-sheet with the mapping in place; link confirmed via a real hyperlink
relationship in the .docx, not just cell text.

Co-Authored-By: Claude Sonnet 5 <noreply@anthropic.com>
</commit_message>
<xml_diff>
--- a/Code/BandInfoForm/tools/doc_templates/3CDC Universal Show Advance.docx
+++ b/Code/BandInfoForm/tools/doc_templates/3CDC Universal Show Advance.docx
@@ -3839,6 +3839,122 @@
                       <w:szCs w:val="20"/>
                     </w:rPr>
                     <w:t xml:space="preserve"/>
+                  </w:r>
+                </w:p>
+              </w:tc>
+            </w:tr>
+            <w:tr>
+              <w:tc>
+                <w:tcPr>
+                  <w:tcW w:type="dxa" w:w="1750"/>
+                  <w:tcMar>
+                    <w:top w:type="dxa" w:w="40"/>
+                    <w:left w:type="dxa" w:w="80"/>
+                    <w:bottom w:type="dxa" w:w="40"/>
+                    <w:right w:type="dxa" w:w="80"/>
+                  </w:tcMar>
+                  <w:vAlign w:val="top"/>
+                </w:tcPr>
+                <w:p>
+                  <w:pPr>
+                    <w:spacing w:after="40"/>
+                    <w:jc w:val="right"/>
+                  </w:pPr>
+                  <w:r>
+                    <w:rPr>
+                      <w:rFonts w:ascii="Calibri" w:cs="Calibri" w:eastAsia="Times New Roman" w:hAnsi="Calibri"/>
+                      <w:b/>
+                      <w:bCs/>
+                      <w:i w:val="false"/>
+                      <w:iCs w:val="false"/>
+                      <w:sz w:val="20"/>
+                      <w:szCs w:val="20"/>
+                    </w:rPr>
+                    <w:t>Lighting Notes</w:t>
+                  </w:r>
+                </w:p>
+              </w:tc>
+              <w:tc>
+                <w:tcPr>
+                  <w:tcW w:type="dxa" w:w="1850"/>
+                  <w:tcMar>
+                    <w:top w:type="dxa" w:w="40"/>
+                    <w:left w:type="dxa" w:w="80"/>
+                    <w:bottom w:type="dxa" w:w="40"/>
+                    <w:right w:type="dxa" w:w="80"/>
+                  </w:tcMar>
+                  <w:vAlign w:val="top"/>
+                </w:tcPr>
+                <w:p>
+                  <w:pPr>
+                    <w:spacing w:after="40"/>
+                  </w:pPr>
+                  <w:r>
+                    <w:rPr>
+                      <w:rFonts w:ascii="Calibri" w:cs="Calibri" w:eastAsia="Times New Roman" w:hAnsi="Calibri"/>
+                      <w:b w:val="false"/>
+                      <w:bCs w:val="false"/>
+                      <w:i w:val="false"/>
+                      <w:iCs w:val="false"/>
+                      <w:sz w:val="20"/>
+                      <w:szCs w:val="20"/>
+                    </w:rPr>
+                  </w:r>
+                </w:p>
+              </w:tc>
+              <w:tc>
+                <w:tcPr>
+                  <w:tcW w:type="dxa" w:w="1850"/>
+                  <w:tcMar>
+                    <w:top w:type="dxa" w:w="40"/>
+                    <w:left w:type="dxa" w:w="80"/>
+                    <w:bottom w:type="dxa" w:w="40"/>
+                    <w:right w:type="dxa" w:w="80"/>
+                  </w:tcMar>
+                  <w:vAlign w:val="top"/>
+                </w:tcPr>
+                <w:p>
+                  <w:pPr>
+                    <w:spacing w:after="40"/>
+                  </w:pPr>
+                  <w:r>
+                    <w:rPr>
+                      <w:rFonts w:ascii="Calibri" w:cs="Calibri" w:eastAsia="Times New Roman" w:hAnsi="Calibri"/>
+                      <w:b w:val="false"/>
+                      <w:bCs w:val="false"/>
+                      <w:i w:val="false"/>
+                      <w:iCs w:val="false"/>
+                      <w:sz w:val="20"/>
+                      <w:szCs w:val="20"/>
+                    </w:rPr>
+                  </w:r>
+                </w:p>
+              </w:tc>
+              <w:tc>
+                <w:tcPr>
+                  <w:tcW w:type="dxa" w:w="1850"/>
+                  <w:tcMar>
+                    <w:top w:type="dxa" w:w="40"/>
+                    <w:left w:type="dxa" w:w="80"/>
+                    <w:bottom w:type="dxa" w:w="40"/>
+                    <w:right w:type="dxa" w:w="80"/>
+                  </w:tcMar>
+                  <w:vAlign w:val="top"/>
+                </w:tcPr>
+                <w:p>
+                  <w:pPr>
+                    <w:spacing w:after="40"/>
+                  </w:pPr>
+                  <w:r>
+                    <w:rPr>
+                      <w:rFonts w:ascii="Calibri" w:cs="Calibri" w:eastAsia="Times New Roman" w:hAnsi="Calibri"/>
+                      <w:b w:val="false"/>
+                      <w:bCs w:val="false"/>
+                      <w:i w:val="false"/>
+                      <w:iCs w:val="false"/>
+                      <w:sz w:val="20"/>
+                      <w:szCs w:val="20"/>
+                    </w:rPr>
                   </w:r>
                 </w:p>
               </w:tc>

</xml_diff>

<commit_message>
band-advance: tighten universal template formatting to fit one page
Was spilling onto a mostly-empty second page (Backline/Buyout/Band
Contact rows, or worse depending on content). Trimmed top/bottom
margins 0.5in -> 0.4in, tightened the oversized 13pt gap under the
contact line to 6pt, matched the stacked Date/Event/Venue/Location
lines to the grid's own 2pt paragraph spacing, and zeroed the
remaining default paragraph spacing across the EVENT INFORMATION/
AUDIO/LIGHTING/MISC grid. Verified via LibreOffice headless render
(1 page) both on the raw blank template and on a real filled advance
doc from the live pipeline. Synced the Nyquist/Blank Advances/
reference copy.

Co-Authored-By: Claude Sonnet 5 <noreply@anthropic.com>
</commit_message>
<xml_diff>
--- a/Code/BandInfoForm/tools/doc_templates/3CDC Universal Show Advance.docx
+++ b/Code/BandInfoForm/tools/doc_templates/3CDC Universal Show Advance.docx
@@ -22,7 +22,7 @@
     </w:p>
     <w:p>
       <w:pPr>
-        <w:spacing w:after="260"/>
+        <w:spacing w:after="120"/>
         <w:jc w:val="center"/>
       </w:pPr>
       <w:r>
@@ -1250,7 +1250,7 @@
                 </w:tcPr>
                 <w:p>
                   <w:pPr>
-                    <w:spacing w:after="40"/>
+                    <w:spacing w:after="0"/>
                   </w:pPr>
                   <w:r>
                     <w:rPr>
@@ -1281,7 +1281,7 @@
                 </w:tcPr>
                 <w:p>
                   <w:pPr>
-                    <w:spacing w:after="30"/>
+                    <w:spacing w:after="0"/>
                   </w:pPr>
                   <w:r>
                     <w:rPr>
@@ -1298,7 +1298,7 @@
                 </w:p>
                 <w:p>
                   <w:pPr>
-                    <w:spacing w:after="120"/>
+                    <w:spacing w:after="0"/>
                   </w:pPr>
                   <w:r>
                     <w:rPr>
@@ -1315,7 +1315,7 @@
                 </w:p>
                 <w:p>
                   <w:pPr>
-                    <w:spacing w:after="120"/>
+                    <w:spacing w:after="0"/>
                   </w:pPr>
                   <w:r>
                     <w:rPr>
@@ -1332,7 +1332,7 @@
                 </w:p>
                 <w:p>
                   <w:pPr>
-                    <w:spacing w:after="120"/>
+                    <w:spacing w:after="0"/>
                   </w:pPr>
                   <w:r>
                     <w:rPr>
@@ -1392,7 +1392,7 @@
                 </w:tcPr>
                 <w:p>
                   <w:pPr>
-                    <w:spacing w:after="40"/>
+                    <w:spacing w:after="0"/>
                   </w:pPr>
                   <w:r>
                     <w:rPr>
@@ -1422,7 +1422,7 @@
                 </w:tcPr>
                 <w:p>
                   <w:pPr>
-                    <w:spacing w:after="30"/>
+                    <w:spacing w:after="0"/>
                   </w:pPr>
                   <w:sdt>
                     <w:sdtPr>
@@ -1471,7 +1471,7 @@
                 </w:p>
                 <w:p>
                   <w:pPr>
-                    <w:spacing w:after="40"/>
+                    <w:spacing w:after="0"/>
                   </w:pPr>
                   <w:r>
                     <w:rPr>
@@ -1541,7 +1541,7 @@
                 </w:tcPr>
                 <w:p>
                   <w:pPr>
-                    <w:spacing w:after="40"/>
+                    <w:spacing w:after="0"/>
                   </w:pPr>
                   <w:r>
                     <w:rPr>
@@ -1572,7 +1572,7 @@
                 </w:tcPr>
                 <w:p>
                   <w:pPr>
-                    <w:spacing w:after="40"/>
+                    <w:spacing w:after="0"/>
                   </w:pPr>
                   <w:r>
                     <w:rPr>
@@ -1603,7 +1603,7 @@
                 </w:tcPr>
                 <w:p>
                   <w:pPr>
-                    <w:spacing w:after="40"/>
+                    <w:spacing w:after="0"/>
                   </w:pPr>
                   <w:r>
                     <w:rPr>
@@ -1632,7 +1632,7 @@
                 </w:tcPr>
                 <w:p>
                   <w:pPr>
-                    <w:spacing w:after="40"/>
+                    <w:spacing w:after="0"/>
                     <w:jc w:val="center"/>
                   </w:pPr>
                   <w:r>
@@ -1650,7 +1650,7 @@
                 </w:p>
                 <w:p>
                   <w:pPr>
-                    <w:spacing w:after="40"/>
+                    <w:spacing w:after="0"/>
                     <w:jc w:val="center"/>
                   </w:pPr>
                   <w:r>
@@ -1680,7 +1680,7 @@
                 </w:tcPr>
                 <w:p>
                   <w:pPr>
-                    <w:spacing w:after="40"/>
+                    <w:spacing w:after="0"/>
                     <w:jc w:val="center"/>
                   </w:pPr>
                   <w:r>
@@ -1698,7 +1698,7 @@
                 </w:p>
                 <w:p>
                   <w:pPr>
-                    <w:spacing w:after="40"/>
+                    <w:spacing w:after="0"/>
                     <w:jc w:val="center"/>
                   </w:pPr>
                   <w:r>
@@ -1728,7 +1728,7 @@
                 </w:tcPr>
                 <w:p>
                   <w:pPr>
-                    <w:spacing w:after="40"/>
+                    <w:spacing w:after="0"/>
                     <w:jc w:val="center"/>
                   </w:pPr>
                   <w:r>
@@ -1746,7 +1746,7 @@
                 </w:p>
                 <w:p>
                   <w:pPr>
-                    <w:spacing w:after="40"/>
+                    <w:spacing w:after="0"/>
                     <w:jc w:val="center"/>
                   </w:pPr>
                   <w:r>
@@ -1778,7 +1778,7 @@
                 </w:tcPr>
                 <w:p>
                   <w:pPr>
-                    <w:spacing w:after="40"/>
+                    <w:spacing w:after="0"/>
                     <w:jc w:val="right"/>
                   </w:pPr>
                   <w:r>
@@ -1808,7 +1808,7 @@
                 </w:tcPr>
                 <w:p>
                   <w:pPr>
-                    <w:spacing w:after="40"/>
+                    <w:spacing w:after="0"/>
                   </w:pPr>
                   <w:r>
                     <w:rPr>
@@ -1837,7 +1837,7 @@
                 </w:tcPr>
                 <w:p>
                   <w:pPr>
-                    <w:spacing w:after="40"/>
+                    <w:spacing w:after="0"/>
                   </w:pPr>
                   <w:r>
                     <w:rPr>
@@ -1866,7 +1866,7 @@
                 </w:tcPr>
                 <w:p>
                   <w:pPr>
-                    <w:spacing w:after="40"/>
+                    <w:spacing w:after="0"/>
                   </w:pPr>
                   <w:r>
                     <w:rPr>
@@ -1897,7 +1897,7 @@
                 </w:tcPr>
                 <w:p>
                   <w:pPr>
-                    <w:spacing w:after="40"/>
+                    <w:spacing w:after="0"/>
                     <w:jc w:val="right"/>
                   </w:pPr>
                   <w:r>
@@ -1927,63 +1927,63 @@
                 </w:tcPr>
                 <w:p>
                   <w:pPr>
-                    <w:spacing w:after="40"/>
-                  </w:pPr>
-                  <w:r>
-                    <w:rPr>
-                      <w:rFonts w:ascii="Calibri" w:cs="Calibri" w:eastAsia="Times New Roman" w:hAnsi="Calibri"/>
-                      <w:b w:val="false"/>
-                      <w:bCs w:val="false"/>
-                      <w:i w:val="false"/>
-                      <w:iCs w:val="false"/>
-                      <w:sz w:val="20"/>
-                      <w:szCs w:val="20"/>
-                    </w:rPr>
-                  </w:r>
-                </w:p>
-              </w:tc>
-              <w:tc>
-                <w:tcPr>
-                  <w:tcW w:type="dxa" w:w="1850"/>
-                  <w:tcMar>
-                    <w:top w:type="dxa" w:w="40"/>
-                    <w:left w:type="dxa" w:w="80"/>
-                    <w:bottom w:type="dxa" w:w="40"/>
-                    <w:right w:type="dxa" w:w="80"/>
-                  </w:tcMar>
-                  <w:vAlign w:val="top"/>
-                </w:tcPr>
-                <w:p>
-                  <w:pPr>
-                    <w:spacing w:after="40"/>
-                  </w:pPr>
-                  <w:r>
-                    <w:rPr>
-                      <w:rFonts w:ascii="Calibri" w:cs="Calibri" w:eastAsia="Times New Roman" w:hAnsi="Calibri"/>
-                      <w:b w:val="false"/>
-                      <w:bCs w:val="false"/>
-                      <w:i w:val="false"/>
-                      <w:iCs w:val="false"/>
-                      <w:sz w:val="20"/>
-                      <w:szCs w:val="20"/>
-                    </w:rPr>
-                  </w:r>
-                </w:p>
-              </w:tc>
-              <w:tc>
-                <w:tcPr>
-                  <w:tcW w:type="dxa" w:w="1850"/>
-                  <w:tcMar>
-                    <w:top w:type="dxa" w:w="40"/>
-                    <w:left w:type="dxa" w:w="80"/>
-                    <w:bottom w:type="dxa" w:w="40"/>
-                    <w:right w:type="dxa" w:w="80"/>
-                  </w:tcMar>
-                  <w:vAlign w:val="top"/>
-                </w:tcPr>
-                <w:p>
-                  <w:pPr>
-                    <w:spacing w:after="40"/>
+                    <w:spacing w:after="0"/>
+                  </w:pPr>
+                  <w:r>
+                    <w:rPr>
+                      <w:rFonts w:ascii="Calibri" w:cs="Calibri" w:eastAsia="Times New Roman" w:hAnsi="Calibri"/>
+                      <w:b w:val="false"/>
+                      <w:bCs w:val="false"/>
+                      <w:i w:val="false"/>
+                      <w:iCs w:val="false"/>
+                      <w:sz w:val="20"/>
+                      <w:szCs w:val="20"/>
+                    </w:rPr>
+                  </w:r>
+                </w:p>
+              </w:tc>
+              <w:tc>
+                <w:tcPr>
+                  <w:tcW w:type="dxa" w:w="1850"/>
+                  <w:tcMar>
+                    <w:top w:type="dxa" w:w="40"/>
+                    <w:left w:type="dxa" w:w="80"/>
+                    <w:bottom w:type="dxa" w:w="40"/>
+                    <w:right w:type="dxa" w:w="80"/>
+                  </w:tcMar>
+                  <w:vAlign w:val="top"/>
+                </w:tcPr>
+                <w:p>
+                  <w:pPr>
+                    <w:spacing w:after="0"/>
+                  </w:pPr>
+                  <w:r>
+                    <w:rPr>
+                      <w:rFonts w:ascii="Calibri" w:cs="Calibri" w:eastAsia="Times New Roman" w:hAnsi="Calibri"/>
+                      <w:b w:val="false"/>
+                      <w:bCs w:val="false"/>
+                      <w:i w:val="false"/>
+                      <w:iCs w:val="false"/>
+                      <w:sz w:val="20"/>
+                      <w:szCs w:val="20"/>
+                    </w:rPr>
+                  </w:r>
+                </w:p>
+              </w:tc>
+              <w:tc>
+                <w:tcPr>
+                  <w:tcW w:type="dxa" w:w="1850"/>
+                  <w:tcMar>
+                    <w:top w:type="dxa" w:w="40"/>
+                    <w:left w:type="dxa" w:w="80"/>
+                    <w:bottom w:type="dxa" w:w="40"/>
+                    <w:right w:type="dxa" w:w="80"/>
+                  </w:tcMar>
+                  <w:vAlign w:val="top"/>
+                </w:tcPr>
+                <w:p>
+                  <w:pPr>
+                    <w:spacing w:after="0"/>
                   </w:pPr>
                   <w:r>
                     <w:rPr>
@@ -2013,7 +2013,7 @@
                 </w:tcPr>
                 <w:p>
                   <w:pPr>
-                    <w:spacing w:after="40"/>
+                    <w:spacing w:after="0"/>
                     <w:jc w:val="right"/>
                   </w:pPr>
                   <w:r>
@@ -2043,7 +2043,7 @@
                 </w:tcPr>
                 <w:p>
                   <w:pPr>
-                    <w:spacing w:after="40"/>
+                    <w:spacing w:after="0"/>
                   </w:pPr>
                   <w:r>
                     <w:rPr>
@@ -2072,7 +2072,7 @@
                 </w:tcPr>
                 <w:p>
                   <w:pPr>
-                    <w:spacing w:after="40"/>
+                    <w:spacing w:after="0"/>
                   </w:pPr>
                   <w:r>
                     <w:rPr>
@@ -2101,7 +2101,7 @@
                 </w:tcPr>
                 <w:p>
                   <w:pPr>
-                    <w:spacing w:after="40"/>
+                    <w:spacing w:after="0"/>
                   </w:pPr>
                   <w:r>
                     <w:rPr>
@@ -2132,7 +2132,7 @@
                 </w:tcPr>
                 <w:p>
                   <w:pPr>
-                    <w:spacing w:after="40"/>
+                    <w:spacing w:after="0"/>
                     <w:jc w:val="right"/>
                   </w:pPr>
                   <w:r>
@@ -2162,7 +2162,7 @@
                 </w:tcPr>
                 <w:p>
                   <w:pPr>
-                    <w:spacing w:after="40"/>
+                    <w:spacing w:after="0"/>
                   </w:pPr>
                   <w:r>
                     <w:rPr>
@@ -2179,7 +2179,7 @@
                 </w:p>
                 <w:p>
                   <w:pPr>
-                    <w:spacing w:after="40"/>
+                    <w:spacing w:after="0"/>
                   </w:pPr>
                   <w:r>
                     <w:rPr>
@@ -2208,7 +2208,7 @@
                 </w:tcPr>
                 <w:p>
                   <w:pPr>
-                    <w:spacing w:after="40"/>
+                    <w:spacing w:after="0"/>
                   </w:pPr>
                   <w:r>
                     <w:rPr>
@@ -2225,7 +2225,7 @@
                 </w:p>
                 <w:p>
                   <w:pPr>
-                    <w:spacing w:after="40"/>
+                    <w:spacing w:after="0"/>
                   </w:pPr>
                   <w:r>
                     <w:rPr>
@@ -2254,7 +2254,7 @@
                 </w:tcPr>
                 <w:p>
                   <w:pPr>
-                    <w:spacing w:after="40"/>
+                    <w:spacing w:after="0"/>
                   </w:pPr>
                   <w:r>
                     <w:rPr>
@@ -2271,7 +2271,7 @@
                 </w:p>
                 <w:p>
                   <w:pPr>
-                    <w:spacing w:after="40"/>
+                    <w:spacing w:after="0"/>
                   </w:pPr>
                   <w:r>
                     <w:rPr>
@@ -2302,7 +2302,7 @@
                 </w:tcPr>
                 <w:p>
                   <w:pPr>
-                    <w:spacing w:after="40"/>
+                    <w:spacing w:after="0"/>
                     <w:jc w:val="right"/>
                   </w:pPr>
                   <w:r>
@@ -2332,111 +2332,111 @@
                 </w:tcPr>
                 <w:p>
                   <w:pPr>
-                    <w:spacing w:after="40"/>
-                  </w:pPr>
-                  <w:r>
-                    <w:rPr>
-                      <w:rFonts w:ascii="Calibri" w:cs="Calibri" w:eastAsia="Times New Roman" w:hAnsi="Calibri"/>
-                      <w:b w:val="false"/>
-                      <w:bCs w:val="false"/>
-                      <w:i w:val="false"/>
-                      <w:iCs w:val="false"/>
-                      <w:sz w:val="20"/>
-                      <w:szCs w:val="20"/>
-                    </w:rPr>
-                  </w:r>
-                </w:p>
-                <w:p>
-                  <w:pPr>
-                    <w:spacing w:after="40"/>
-                  </w:pPr>
-                  <w:r>
-                    <w:rPr>
-                      <w:rFonts w:ascii="Calibri" w:cs="Calibri" w:eastAsia="Times New Roman" w:hAnsi="Calibri"/>
-                      <w:b w:val="false"/>
-                      <w:bCs w:val="false"/>
-                      <w:i w:val="false"/>
-                      <w:iCs w:val="false"/>
-                      <w:sz w:val="20"/>
-                      <w:szCs w:val="20"/>
-                    </w:rPr>
-                  </w:r>
-                </w:p>
-              </w:tc>
-              <w:tc>
-                <w:tcPr>
-                  <w:tcW w:type="dxa" w:w="1850"/>
-                  <w:tcMar>
-                    <w:top w:type="dxa" w:w="40"/>
-                    <w:left w:type="dxa" w:w="80"/>
-                    <w:bottom w:type="dxa" w:w="40"/>
-                    <w:right w:type="dxa" w:w="80"/>
-                  </w:tcMar>
-                  <w:vAlign w:val="top"/>
-                </w:tcPr>
-                <w:p>
-                  <w:pPr>
-                    <w:spacing w:after="40"/>
-                  </w:pPr>
-                  <w:r>
-                    <w:rPr>
-                      <w:rFonts w:ascii="Calibri" w:cs="Calibri" w:eastAsia="Times New Roman" w:hAnsi="Calibri"/>
-                      <w:b w:val="false"/>
-                      <w:bCs w:val="false"/>
-                      <w:i w:val="false"/>
-                      <w:iCs w:val="false"/>
-                      <w:sz w:val="20"/>
-                      <w:szCs w:val="20"/>
-                    </w:rPr>
-                  </w:r>
-                </w:p>
-                <w:p>
-                  <w:pPr>
-                    <w:spacing w:after="40"/>
-                  </w:pPr>
-                  <w:r>
-                    <w:rPr>
-                      <w:rFonts w:ascii="Calibri" w:cs="Calibri" w:eastAsia="Times New Roman" w:hAnsi="Calibri"/>
-                      <w:b w:val="false"/>
-                      <w:bCs w:val="false"/>
-                      <w:i w:val="false"/>
-                      <w:iCs w:val="false"/>
-                      <w:sz w:val="20"/>
-                      <w:szCs w:val="20"/>
-                    </w:rPr>
-                  </w:r>
-                </w:p>
-              </w:tc>
-              <w:tc>
-                <w:tcPr>
-                  <w:tcW w:type="dxa" w:w="1850"/>
-                  <w:tcMar>
-                    <w:top w:type="dxa" w:w="40"/>
-                    <w:left w:type="dxa" w:w="80"/>
-                    <w:bottom w:type="dxa" w:w="40"/>
-                    <w:right w:type="dxa" w:w="80"/>
-                  </w:tcMar>
-                  <w:vAlign w:val="top"/>
-                </w:tcPr>
-                <w:p>
-                  <w:pPr>
-                    <w:spacing w:after="40"/>
-                  </w:pPr>
-                  <w:r>
-                    <w:rPr>
-                      <w:rFonts w:ascii="Calibri" w:cs="Calibri" w:eastAsia="Times New Roman" w:hAnsi="Calibri"/>
-                      <w:b w:val="false"/>
-                      <w:bCs w:val="false"/>
-                      <w:i w:val="false"/>
-                      <w:iCs w:val="false"/>
-                      <w:sz w:val="20"/>
-                      <w:szCs w:val="20"/>
-                    </w:rPr>
-                  </w:r>
-                </w:p>
-                <w:p>
-                  <w:pPr>
-                    <w:spacing w:after="40"/>
+                    <w:spacing w:after="0"/>
+                  </w:pPr>
+                  <w:r>
+                    <w:rPr>
+                      <w:rFonts w:ascii="Calibri" w:cs="Calibri" w:eastAsia="Times New Roman" w:hAnsi="Calibri"/>
+                      <w:b w:val="false"/>
+                      <w:bCs w:val="false"/>
+                      <w:i w:val="false"/>
+                      <w:iCs w:val="false"/>
+                      <w:sz w:val="20"/>
+                      <w:szCs w:val="20"/>
+                    </w:rPr>
+                  </w:r>
+                </w:p>
+                <w:p>
+                  <w:pPr>
+                    <w:spacing w:after="0"/>
+                  </w:pPr>
+                  <w:r>
+                    <w:rPr>
+                      <w:rFonts w:ascii="Calibri" w:cs="Calibri" w:eastAsia="Times New Roman" w:hAnsi="Calibri"/>
+                      <w:b w:val="false"/>
+                      <w:bCs w:val="false"/>
+                      <w:i w:val="false"/>
+                      <w:iCs w:val="false"/>
+                      <w:sz w:val="20"/>
+                      <w:szCs w:val="20"/>
+                    </w:rPr>
+                  </w:r>
+                </w:p>
+              </w:tc>
+              <w:tc>
+                <w:tcPr>
+                  <w:tcW w:type="dxa" w:w="1850"/>
+                  <w:tcMar>
+                    <w:top w:type="dxa" w:w="40"/>
+                    <w:left w:type="dxa" w:w="80"/>
+                    <w:bottom w:type="dxa" w:w="40"/>
+                    <w:right w:type="dxa" w:w="80"/>
+                  </w:tcMar>
+                  <w:vAlign w:val="top"/>
+                </w:tcPr>
+                <w:p>
+                  <w:pPr>
+                    <w:spacing w:after="0"/>
+                  </w:pPr>
+                  <w:r>
+                    <w:rPr>
+                      <w:rFonts w:ascii="Calibri" w:cs="Calibri" w:eastAsia="Times New Roman" w:hAnsi="Calibri"/>
+                      <w:b w:val="false"/>
+                      <w:bCs w:val="false"/>
+                      <w:i w:val="false"/>
+                      <w:iCs w:val="false"/>
+                      <w:sz w:val="20"/>
+                      <w:szCs w:val="20"/>
+                    </w:rPr>
+                  </w:r>
+                </w:p>
+                <w:p>
+                  <w:pPr>
+                    <w:spacing w:after="0"/>
+                  </w:pPr>
+                  <w:r>
+                    <w:rPr>
+                      <w:rFonts w:ascii="Calibri" w:cs="Calibri" w:eastAsia="Times New Roman" w:hAnsi="Calibri"/>
+                      <w:b w:val="false"/>
+                      <w:bCs w:val="false"/>
+                      <w:i w:val="false"/>
+                      <w:iCs w:val="false"/>
+                      <w:sz w:val="20"/>
+                      <w:szCs w:val="20"/>
+                    </w:rPr>
+                  </w:r>
+                </w:p>
+              </w:tc>
+              <w:tc>
+                <w:tcPr>
+                  <w:tcW w:type="dxa" w:w="1850"/>
+                  <w:tcMar>
+                    <w:top w:type="dxa" w:w="40"/>
+                    <w:left w:type="dxa" w:w="80"/>
+                    <w:bottom w:type="dxa" w:w="40"/>
+                    <w:right w:type="dxa" w:w="80"/>
+                  </w:tcMar>
+                  <w:vAlign w:val="top"/>
+                </w:tcPr>
+                <w:p>
+                  <w:pPr>
+                    <w:spacing w:after="0"/>
+                  </w:pPr>
+                  <w:r>
+                    <w:rPr>
+                      <w:rFonts w:ascii="Calibri" w:cs="Calibri" w:eastAsia="Times New Roman" w:hAnsi="Calibri"/>
+                      <w:b w:val="false"/>
+                      <w:bCs w:val="false"/>
+                      <w:i w:val="false"/>
+                      <w:iCs w:val="false"/>
+                      <w:sz w:val="20"/>
+                      <w:szCs w:val="20"/>
+                    </w:rPr>
+                  </w:r>
+                </w:p>
+                <w:p>
+                  <w:pPr>
+                    <w:spacing w:after="0"/>
                   </w:pPr>
                   <w:r>
                     <w:rPr>
@@ -2466,7 +2466,7 @@
                 </w:tcPr>
                 <w:p>
                   <w:pPr>
-                    <w:spacing w:after="40"/>
+                    <w:spacing w:after="0"/>
                     <w:jc w:val="right"/>
                   </w:pPr>
                   <w:r>
@@ -2496,7 +2496,7 @@
                 </w:tcPr>
                 <w:p>
                   <w:pPr>
-                    <w:spacing w:after="40"/>
+                    <w:spacing w:after="0"/>
                   </w:pPr>
                   <w:r>
                     <w:rPr>
@@ -2525,7 +2525,7 @@
                 </w:tcPr>
                 <w:p>
                   <w:pPr>
-                    <w:spacing w:after="40"/>
+                    <w:spacing w:after="0"/>
                   </w:pPr>
                   <w:r>
                     <w:rPr>
@@ -2554,7 +2554,7 @@
                 </w:tcPr>
                 <w:p>
                   <w:pPr>
-                    <w:spacing w:after="40"/>
+                    <w:spacing w:after="0"/>
                   </w:pPr>
                   <w:r>
                     <w:rPr>
@@ -2585,7 +2585,7 @@
                 </w:tcPr>
                 <w:p>
                   <w:pPr>
-                    <w:spacing w:after="40"/>
+                    <w:spacing w:after="0"/>
                     <w:jc w:val="right"/>
                   </w:pPr>
                   <w:r>
@@ -2615,7 +2615,7 @@
                 </w:tcPr>
                 <w:p>
                   <w:pPr>
-                    <w:spacing w:after="40"/>
+                    <w:spacing w:after="0"/>
                   </w:pPr>
                   <w:sdt>
                     <w:sdtPr>
@@ -2676,7 +2676,7 @@
                 </w:tcPr>
                 <w:p>
                   <w:pPr>
-                    <w:spacing w:after="40"/>
+                    <w:spacing w:after="0"/>
                   </w:pPr>
                   <w:sdt>
                     <w:sdtPr>
@@ -2737,7 +2737,7 @@
                 </w:tcPr>
                 <w:p>
                   <w:pPr>
-                    <w:spacing w:after="40"/>
+                    <w:spacing w:after="0"/>
                   </w:pPr>
                   <w:sdt>
                     <w:sdtPr>
@@ -2800,7 +2800,7 @@
                 </w:tcPr>
                 <w:p>
                   <w:pPr>
-                    <w:spacing w:after="40"/>
+                    <w:spacing w:after="0"/>
                     <w:jc w:val="right"/>
                   </w:pPr>
                   <w:r>
@@ -2830,63 +2830,63 @@
                 </w:tcPr>
                 <w:p>
                   <w:pPr>
-                    <w:spacing w:after="40"/>
-                  </w:pPr>
-                  <w:r>
-                    <w:rPr>
-                      <w:rFonts w:ascii="Calibri" w:cs="Calibri" w:eastAsia="Times New Roman" w:hAnsi="Calibri"/>
-                      <w:b w:val="false"/>
-                      <w:bCs w:val="false"/>
-                      <w:i w:val="false"/>
-                      <w:iCs w:val="false"/>
-                      <w:sz w:val="20"/>
-                      <w:szCs w:val="20"/>
-                    </w:rPr>
-                  </w:r>
-                </w:p>
-              </w:tc>
-              <w:tc>
-                <w:tcPr>
-                  <w:tcW w:type="dxa" w:w="1850"/>
-                  <w:tcMar>
-                    <w:top w:type="dxa" w:w="40"/>
-                    <w:left w:type="dxa" w:w="80"/>
-                    <w:bottom w:type="dxa" w:w="40"/>
-                    <w:right w:type="dxa" w:w="80"/>
-                  </w:tcMar>
-                  <w:vAlign w:val="top"/>
-                </w:tcPr>
-                <w:p>
-                  <w:pPr>
-                    <w:spacing w:after="40"/>
-                  </w:pPr>
-                  <w:r>
-                    <w:rPr>
-                      <w:rFonts w:ascii="Calibri" w:cs="Calibri" w:eastAsia="Times New Roman" w:hAnsi="Calibri"/>
-                      <w:b w:val="false"/>
-                      <w:bCs w:val="false"/>
-                      <w:i w:val="false"/>
-                      <w:iCs w:val="false"/>
-                      <w:sz w:val="20"/>
-                      <w:szCs w:val="20"/>
-                    </w:rPr>
-                  </w:r>
-                </w:p>
-              </w:tc>
-              <w:tc>
-                <w:tcPr>
-                  <w:tcW w:type="dxa" w:w="1850"/>
-                  <w:tcMar>
-                    <w:top w:type="dxa" w:w="40"/>
-                    <w:left w:type="dxa" w:w="80"/>
-                    <w:bottom w:type="dxa" w:w="40"/>
-                    <w:right w:type="dxa" w:w="80"/>
-                  </w:tcMar>
-                  <w:vAlign w:val="top"/>
-                </w:tcPr>
-                <w:p>
-                  <w:pPr>
-                    <w:spacing w:after="40"/>
+                    <w:spacing w:after="0"/>
+                  </w:pPr>
+                  <w:r>
+                    <w:rPr>
+                      <w:rFonts w:ascii="Calibri" w:cs="Calibri" w:eastAsia="Times New Roman" w:hAnsi="Calibri"/>
+                      <w:b w:val="false"/>
+                      <w:bCs w:val="false"/>
+                      <w:i w:val="false"/>
+                      <w:iCs w:val="false"/>
+                      <w:sz w:val="20"/>
+                      <w:szCs w:val="20"/>
+                    </w:rPr>
+                  </w:r>
+                </w:p>
+              </w:tc>
+              <w:tc>
+                <w:tcPr>
+                  <w:tcW w:type="dxa" w:w="1850"/>
+                  <w:tcMar>
+                    <w:top w:type="dxa" w:w="40"/>
+                    <w:left w:type="dxa" w:w="80"/>
+                    <w:bottom w:type="dxa" w:w="40"/>
+                    <w:right w:type="dxa" w:w="80"/>
+                  </w:tcMar>
+                  <w:vAlign w:val="top"/>
+                </w:tcPr>
+                <w:p>
+                  <w:pPr>
+                    <w:spacing w:after="0"/>
+                  </w:pPr>
+                  <w:r>
+                    <w:rPr>
+                      <w:rFonts w:ascii="Calibri" w:cs="Calibri" w:eastAsia="Times New Roman" w:hAnsi="Calibri"/>
+                      <w:b w:val="false"/>
+                      <w:bCs w:val="false"/>
+                      <w:i w:val="false"/>
+                      <w:iCs w:val="false"/>
+                      <w:sz w:val="20"/>
+                      <w:szCs w:val="20"/>
+                    </w:rPr>
+                  </w:r>
+                </w:p>
+              </w:tc>
+              <w:tc>
+                <w:tcPr>
+                  <w:tcW w:type="dxa" w:w="1850"/>
+                  <w:tcMar>
+                    <w:top w:type="dxa" w:w="40"/>
+                    <w:left w:type="dxa" w:w="80"/>
+                    <w:bottom w:type="dxa" w:w="40"/>
+                    <w:right w:type="dxa" w:w="80"/>
+                  </w:tcMar>
+                  <w:vAlign w:val="top"/>
+                </w:tcPr>
+                <w:p>
+                  <w:pPr>
+                    <w:spacing w:after="0"/>
                   </w:pPr>
                   <w:r>
                     <w:rPr>
@@ -2916,7 +2916,7 @@
                 </w:tcPr>
                 <w:p>
                   <w:pPr>
-                    <w:spacing w:after="40"/>
+                    <w:spacing w:after="0"/>
                     <w:jc w:val="right"/>
                   </w:pPr>
                   <w:r>
@@ -2946,7 +2946,7 @@
                 </w:tcPr>
                 <w:p>
                   <w:pPr>
-                    <w:spacing w:after="40"/>
+                    <w:spacing w:after="0"/>
                   </w:pPr>
                   <w:r>
                     <w:rPr>
@@ -2975,7 +2975,7 @@
                 </w:tcPr>
                 <w:p>
                   <w:pPr>
-                    <w:spacing w:after="40"/>
+                    <w:spacing w:after="0"/>
                   </w:pPr>
                   <w:r>
                     <w:rPr>
@@ -3004,7 +3004,7 @@
                 </w:tcPr>
                 <w:p>
                   <w:pPr>
-                    <w:spacing w:after="40"/>
+                    <w:spacing w:after="0"/>
                   </w:pPr>
                   <w:r>
                     <w:rPr>
@@ -3035,7 +3035,7 @@
                 </w:tcPr>
                 <w:p>
                   <w:pPr>
-                    <w:spacing w:after="40"/>
+                    <w:spacing w:after="0"/>
                     <w:jc w:val="right"/>
                   </w:pPr>
                   <w:r>
@@ -3065,7 +3065,7 @@
                 </w:tcPr>
                 <w:p>
                   <w:pPr>
-                    <w:spacing w:after="40"/>
+                    <w:spacing w:after="0"/>
                   </w:pPr>
                   <w:r>
                     <w:rPr>
@@ -3094,7 +3094,7 @@
                 </w:tcPr>
                 <w:p>
                   <w:pPr>
-                    <w:spacing w:after="40"/>
+                    <w:spacing w:after="0"/>
                   </w:pPr>
                   <w:r>
                     <w:rPr>
@@ -3123,7 +3123,7 @@
                 </w:tcPr>
                 <w:p>
                   <w:pPr>
-                    <w:spacing w:after="40"/>
+                    <w:spacing w:after="0"/>
                   </w:pPr>
                   <w:r>
                     <w:rPr>
@@ -3154,7 +3154,7 @@
                 </w:tcPr>
                 <w:p>
                   <w:pPr>
-                    <w:spacing w:after="40"/>
+                    <w:spacing w:after="0"/>
                     <w:jc w:val="right"/>
                   </w:pPr>
                   <w:r>
@@ -3184,7 +3184,7 @@
                 </w:tcPr>
                 <w:p>
                   <w:pPr>
-                    <w:spacing w:after="40"/>
+                    <w:spacing w:after="0"/>
                   </w:pPr>
                   <w:sdt>
                     <w:sdtPr>
@@ -3257,7 +3257,7 @@
                 </w:tcPr>
                 <w:p>
                   <w:pPr>
-                    <w:spacing w:after="40"/>
+                    <w:spacing w:after="0"/>
                   </w:pPr>
                   <w:sdt>
                     <w:sdtPr>
@@ -3330,7 +3330,7 @@
                 </w:tcPr>
                 <w:p>
                   <w:pPr>
-                    <w:spacing w:after="40"/>
+                    <w:spacing w:after="0"/>
                   </w:pPr>
                   <w:sdt>
                     <w:sdtPr>
@@ -3405,7 +3405,7 @@
                 </w:tcPr>
                 <w:p>
                   <w:pPr>
-                    <w:spacing w:after="40"/>
+                    <w:spacing w:after="0"/>
                     <w:jc w:val="right"/>
                   </w:pPr>
                   <w:r>
@@ -3435,7 +3435,7 @@
                 </w:tcPr>
                 <w:p>
                   <w:pPr>
-                    <w:spacing w:after="40"/>
+                    <w:spacing w:after="0"/>
                   </w:pPr>
                   <w:sdt>
                     <w:sdtPr>
@@ -3496,7 +3496,7 @@
                 </w:tcPr>
                 <w:p>
                   <w:pPr>
-                    <w:spacing w:after="40"/>
+                    <w:spacing w:after="0"/>
                   </w:pPr>
                   <w:sdt>
                     <w:sdtPr>
@@ -3557,7 +3557,7 @@
                 </w:tcPr>
                 <w:p>
                   <w:pPr>
-                    <w:spacing w:after="40"/>
+                    <w:spacing w:after="0"/>
                   </w:pPr>
                   <w:sdt>
                     <w:sdtPr>
@@ -3620,7 +3620,7 @@
                 </w:tcPr>
                 <w:p>
                   <w:pPr>
-                    <w:spacing w:after="40"/>
+                    <w:spacing w:after="0"/>
                     <w:jc w:val="right"/>
                   </w:pPr>
                   <w:r>
@@ -3650,7 +3650,7 @@
                 </w:tcPr>
                 <w:p>
                   <w:pPr>
-                    <w:spacing w:after="40"/>
+                    <w:spacing w:after="0"/>
                   </w:pPr>
                   <w:r>
                     <w:rPr>
@@ -3679,7 +3679,7 @@
                 </w:tcPr>
                 <w:p>
                   <w:pPr>
-                    <w:spacing w:after="40"/>
+                    <w:spacing w:after="0"/>
                   </w:pPr>
                   <w:r>
                     <w:rPr>
@@ -3708,7 +3708,7 @@
                 </w:tcPr>
                 <w:p>
                   <w:pPr>
-                    <w:spacing w:after="40"/>
+                    <w:spacing w:after="0"/>
                   </w:pPr>
                   <w:r>
                     <w:rPr>
@@ -3739,7 +3739,7 @@
                 </w:tcPr>
                 <w:p>
                   <w:pPr>
-                    <w:spacing w:after="40"/>
+                    <w:spacing w:after="0"/>
                     <w:jc w:val="right"/>
                   </w:pPr>
                   <w:r>
@@ -3769,63 +3769,63 @@
                 </w:tcPr>
                 <w:p>
                   <w:pPr>
-                    <w:spacing w:after="40"/>
-                  </w:pPr>
-                  <w:r>
-                    <w:rPr>
-                      <w:rFonts w:ascii="Calibri" w:cs="Calibri" w:eastAsia="Times New Roman" w:hAnsi="Calibri"/>
-                      <w:b w:val="false"/>
-                      <w:bCs w:val="false"/>
-                      <w:i w:val="false"/>
-                      <w:iCs w:val="false"/>
-                      <w:sz w:val="20"/>
-                      <w:szCs w:val="20"/>
-                    </w:rPr>
-                  </w:r>
-                </w:p>
-              </w:tc>
-              <w:tc>
-                <w:tcPr>
-                  <w:tcW w:type="dxa" w:w="1850"/>
-                  <w:tcMar>
-                    <w:top w:type="dxa" w:w="40"/>
-                    <w:left w:type="dxa" w:w="80"/>
-                    <w:bottom w:type="dxa" w:w="40"/>
-                    <w:right w:type="dxa" w:w="80"/>
-                  </w:tcMar>
-                  <w:vAlign w:val="top"/>
-                </w:tcPr>
-                <w:p>
-                  <w:pPr>
-                    <w:spacing w:after="40"/>
-                  </w:pPr>
-                  <w:r>
-                    <w:rPr>
-                      <w:rFonts w:ascii="Calibri" w:cs="Calibri" w:eastAsia="Times New Roman" w:hAnsi="Calibri"/>
-                      <w:b w:val="false"/>
-                      <w:bCs w:val="false"/>
-                      <w:i w:val="false"/>
-                      <w:iCs w:val="false"/>
-                      <w:sz w:val="20"/>
-                      <w:szCs w:val="20"/>
-                    </w:rPr>
-                  </w:r>
-                </w:p>
-              </w:tc>
-              <w:tc>
-                <w:tcPr>
-                  <w:tcW w:type="dxa" w:w="1850"/>
-                  <w:tcMar>
-                    <w:top w:type="dxa" w:w="40"/>
-                    <w:left w:type="dxa" w:w="80"/>
-                    <w:bottom w:type="dxa" w:w="40"/>
-                    <w:right w:type="dxa" w:w="80"/>
-                  </w:tcMar>
-                  <w:vAlign w:val="top"/>
-                </w:tcPr>
-                <w:p>
-                  <w:pPr>
-                    <w:spacing w:after="40"/>
+                    <w:spacing w:after="0"/>
+                  </w:pPr>
+                  <w:r>
+                    <w:rPr>
+                      <w:rFonts w:ascii="Calibri" w:cs="Calibri" w:eastAsia="Times New Roman" w:hAnsi="Calibri"/>
+                      <w:b w:val="false"/>
+                      <w:bCs w:val="false"/>
+                      <w:i w:val="false"/>
+                      <w:iCs w:val="false"/>
+                      <w:sz w:val="20"/>
+                      <w:szCs w:val="20"/>
+                    </w:rPr>
+                  </w:r>
+                </w:p>
+              </w:tc>
+              <w:tc>
+                <w:tcPr>
+                  <w:tcW w:type="dxa" w:w="1850"/>
+                  <w:tcMar>
+                    <w:top w:type="dxa" w:w="40"/>
+                    <w:left w:type="dxa" w:w="80"/>
+                    <w:bottom w:type="dxa" w:w="40"/>
+                    <w:right w:type="dxa" w:w="80"/>
+                  </w:tcMar>
+                  <w:vAlign w:val="top"/>
+                </w:tcPr>
+                <w:p>
+                  <w:pPr>
+                    <w:spacing w:after="0"/>
+                  </w:pPr>
+                  <w:r>
+                    <w:rPr>
+                      <w:rFonts w:ascii="Calibri" w:cs="Calibri" w:eastAsia="Times New Roman" w:hAnsi="Calibri"/>
+                      <w:b w:val="false"/>
+                      <w:bCs w:val="false"/>
+                      <w:i w:val="false"/>
+                      <w:iCs w:val="false"/>
+                      <w:sz w:val="20"/>
+                      <w:szCs w:val="20"/>
+                    </w:rPr>
+                  </w:r>
+                </w:p>
+              </w:tc>
+              <w:tc>
+                <w:tcPr>
+                  <w:tcW w:type="dxa" w:w="1850"/>
+                  <w:tcMar>
+                    <w:top w:type="dxa" w:w="40"/>
+                    <w:left w:type="dxa" w:w="80"/>
+                    <w:bottom w:type="dxa" w:w="40"/>
+                    <w:right w:type="dxa" w:w="80"/>
+                  </w:tcMar>
+                  <w:vAlign w:val="top"/>
+                </w:tcPr>
+                <w:p>
+                  <w:pPr>
+                    <w:spacing w:after="0"/>
                   </w:pPr>
                   <w:r>
                     <w:rPr>
@@ -3855,7 +3855,7 @@
                 </w:tcPr>
                 <w:p>
                   <w:pPr>
-                    <w:spacing w:after="40"/>
+                    <w:spacing w:after="0"/>
                     <w:jc w:val="right"/>
                   </w:pPr>
                   <w:r>
@@ -3885,7 +3885,7 @@
                 </w:tcPr>
                 <w:p>
                   <w:pPr>
-                    <w:spacing w:after="40"/>
+                    <w:spacing w:after="0"/>
                   </w:pPr>
                   <w:r>
                     <w:rPr>
@@ -3914,7 +3914,7 @@
                 </w:tcPr>
                 <w:p>
                   <w:pPr>
-                    <w:spacing w:after="40"/>
+                    <w:spacing w:after="0"/>
                   </w:pPr>
                   <w:r>
                     <w:rPr>
@@ -3943,7 +3943,7 @@
                 </w:tcPr>
                 <w:p>
                   <w:pPr>
-                    <w:spacing w:after="40"/>
+                    <w:spacing w:after="0"/>
                   </w:pPr>
                   <w:r>
                     <w:rPr>
@@ -3975,7 +3975,7 @@
                 </w:tcPr>
                 <w:p>
                   <w:pPr>
-                    <w:spacing w:after="40"/>
+                    <w:spacing w:after="0"/>
                   </w:pPr>
                   <w:r>
                     <w:rPr>
@@ -4006,7 +4006,7 @@
                 </w:tcPr>
                 <w:p>
                   <w:pPr>
-                    <w:spacing w:after="40"/>
+                    <w:spacing w:after="0"/>
                   </w:pPr>
                   <w:r>
                     <w:rPr>
@@ -4037,7 +4037,7 @@
                 </w:tcPr>
                 <w:p>
                   <w:pPr>
-                    <w:spacing w:after="40"/>
+                    <w:spacing w:after="0"/>
                     <w:jc w:val="right"/>
                   </w:pPr>
                   <w:r>
@@ -4067,7 +4067,7 @@
                 </w:tcPr>
                 <w:p>
                   <w:pPr>
-                    <w:spacing w:after="40"/>
+                    <w:spacing w:after="0"/>
                   </w:pPr>
                   <w:r>
                     <w:rPr>
@@ -4096,7 +4096,7 @@
                 </w:tcPr>
                 <w:p>
                   <w:pPr>
-                    <w:spacing w:after="40"/>
+                    <w:spacing w:after="0"/>
                   </w:pPr>
                   <w:r>
                     <w:rPr>
@@ -4125,7 +4125,7 @@
                 </w:tcPr>
                 <w:p>
                   <w:pPr>
-                    <w:spacing w:after="40"/>
+                    <w:spacing w:after="0"/>
                   </w:pPr>
                   <w:r>
                     <w:rPr>
@@ -4156,7 +4156,7 @@
                 </w:tcPr>
                 <w:p>
                   <w:pPr>
-                    <w:spacing w:after="40"/>
+                    <w:spacing w:after="0"/>
                     <w:jc w:val="right"/>
                   </w:pPr>
                   <w:r>
@@ -4186,7 +4186,7 @@
                 </w:tcPr>
                 <w:p>
                   <w:pPr>
-                    <w:spacing w:after="40"/>
+                    <w:spacing w:after="0"/>
                   </w:pPr>
                   <w:r>
                     <w:rPr>
@@ -4215,7 +4215,7 @@
                 </w:tcPr>
                 <w:p>
                   <w:pPr>
-                    <w:spacing w:after="40"/>
+                    <w:spacing w:after="0"/>
                   </w:pPr>
                   <w:r>
                     <w:rPr>
@@ -4244,7 +4244,7 @@
                 </w:tcPr>
                 <w:p>
                   <w:pPr>
-                    <w:spacing w:after="40"/>
+                    <w:spacing w:after="0"/>
                   </w:pPr>
                   <w:r>
                     <w:rPr>
@@ -4275,7 +4275,7 @@
                 </w:tcPr>
                 <w:p>
                   <w:pPr>
-                    <w:spacing w:after="40"/>
+                    <w:spacing w:after="0"/>
                     <w:jc w:val="right"/>
                   </w:pPr>
                   <w:r>
@@ -4305,63 +4305,63 @@
                 </w:tcPr>
                 <w:p>
                   <w:pPr>
-                    <w:spacing w:after="40"/>
-                  </w:pPr>
-                  <w:r>
-                    <w:rPr>
-                      <w:rFonts w:ascii="Calibri" w:cs="Calibri" w:eastAsia="Times New Roman" w:hAnsi="Calibri"/>
-                      <w:b w:val="false"/>
-                      <w:bCs w:val="false"/>
-                      <w:i w:val="false"/>
-                      <w:iCs w:val="false"/>
-                      <w:sz w:val="20"/>
-                      <w:szCs w:val="20"/>
-                    </w:rPr>
-                  </w:r>
-                </w:p>
-              </w:tc>
-              <w:tc>
-                <w:tcPr>
-                  <w:tcW w:type="dxa" w:w="1850"/>
-                  <w:tcMar>
-                    <w:top w:type="dxa" w:w="40"/>
-                    <w:left w:type="dxa" w:w="80"/>
-                    <w:bottom w:type="dxa" w:w="40"/>
-                    <w:right w:type="dxa" w:w="80"/>
-                  </w:tcMar>
-                  <w:vAlign w:val="top"/>
-                </w:tcPr>
-                <w:p>
-                  <w:pPr>
-                    <w:spacing w:after="40"/>
-                  </w:pPr>
-                  <w:r>
-                    <w:rPr>
-                      <w:rFonts w:ascii="Calibri" w:cs="Calibri" w:eastAsia="Times New Roman" w:hAnsi="Calibri"/>
-                      <w:b w:val="false"/>
-                      <w:bCs w:val="false"/>
-                      <w:i w:val="false"/>
-                      <w:iCs w:val="false"/>
-                      <w:sz w:val="20"/>
-                      <w:szCs w:val="20"/>
-                    </w:rPr>
-                  </w:r>
-                </w:p>
-              </w:tc>
-              <w:tc>
-                <w:tcPr>
-                  <w:tcW w:type="dxa" w:w="1850"/>
-                  <w:tcMar>
-                    <w:top w:type="dxa" w:w="40"/>
-                    <w:left w:type="dxa" w:w="80"/>
-                    <w:bottom w:type="dxa" w:w="40"/>
-                    <w:right w:type="dxa" w:w="80"/>
-                  </w:tcMar>
-                  <w:vAlign w:val="top"/>
-                </w:tcPr>
-                <w:p>
-                  <w:pPr>
-                    <w:spacing w:after="40"/>
+                    <w:spacing w:after="0"/>
+                  </w:pPr>
+                  <w:r>
+                    <w:rPr>
+                      <w:rFonts w:ascii="Calibri" w:cs="Calibri" w:eastAsia="Times New Roman" w:hAnsi="Calibri"/>
+                      <w:b w:val="false"/>
+                      <w:bCs w:val="false"/>
+                      <w:i w:val="false"/>
+                      <w:iCs w:val="false"/>
+                      <w:sz w:val="20"/>
+                      <w:szCs w:val="20"/>
+                    </w:rPr>
+                  </w:r>
+                </w:p>
+              </w:tc>
+              <w:tc>
+                <w:tcPr>
+                  <w:tcW w:type="dxa" w:w="1850"/>
+                  <w:tcMar>
+                    <w:top w:type="dxa" w:w="40"/>
+                    <w:left w:type="dxa" w:w="80"/>
+                    <w:bottom w:type="dxa" w:w="40"/>
+                    <w:right w:type="dxa" w:w="80"/>
+                  </w:tcMar>
+                  <w:vAlign w:val="top"/>
+                </w:tcPr>
+                <w:p>
+                  <w:pPr>
+                    <w:spacing w:after="0"/>
+                  </w:pPr>
+                  <w:r>
+                    <w:rPr>
+                      <w:rFonts w:ascii="Calibri" w:cs="Calibri" w:eastAsia="Times New Roman" w:hAnsi="Calibri"/>
+                      <w:b w:val="false"/>
+                      <w:bCs w:val="false"/>
+                      <w:i w:val="false"/>
+                      <w:iCs w:val="false"/>
+                      <w:sz w:val="20"/>
+                      <w:szCs w:val="20"/>
+                    </w:rPr>
+                  </w:r>
+                </w:p>
+              </w:tc>
+              <w:tc>
+                <w:tcPr>
+                  <w:tcW w:type="dxa" w:w="1850"/>
+                  <w:tcMar>
+                    <w:top w:type="dxa" w:w="40"/>
+                    <w:left w:type="dxa" w:w="80"/>
+                    <w:bottom w:type="dxa" w:w="40"/>
+                    <w:right w:type="dxa" w:w="80"/>
+                  </w:tcMar>
+                  <w:vAlign w:val="top"/>
+                </w:tcPr>
+                <w:p>
+                  <w:pPr>
+                    <w:spacing w:after="0"/>
                   </w:pPr>
                   <w:r>
                     <w:rPr>
@@ -4391,7 +4391,7 @@
                 </w:tcPr>
                 <w:p>
                   <w:pPr>
-                    <w:spacing w:after="40"/>
+                    <w:spacing w:after="0"/>
                     <w:jc w:val="right"/>
                   </w:pPr>
                   <w:r>
@@ -4421,7 +4421,7 @@
                 </w:tcPr>
                 <w:p>
                   <w:pPr>
-                    <w:spacing w:after="40"/>
+                    <w:spacing w:after="0"/>
                   </w:pPr>
                   <w:r>
                     <w:rPr>
@@ -4450,7 +4450,7 @@
                 </w:tcPr>
                 <w:p>
                   <w:pPr>
-                    <w:spacing w:after="40"/>
+                    <w:spacing w:after="0"/>
                   </w:pPr>
                   <w:r>
                     <w:rPr>
@@ -4479,7 +4479,7 @@
                 </w:tcPr>
                 <w:p>
                   <w:pPr>
-                    <w:spacing w:after="40"/>
+                    <w:spacing w:after="0"/>
                   </w:pPr>
                   <w:r>
                     <w:rPr>
@@ -4510,7 +4510,7 @@
                 </w:tcPr>
                 <w:p>
                   <w:pPr>
-                    <w:spacing w:after="40"/>
+                    <w:spacing w:after="0"/>
                     <w:jc w:val="right"/>
                   </w:pPr>
                   <w:r>
@@ -4540,7 +4540,7 @@
                 </w:tcPr>
                 <w:p>
                   <w:pPr>
-                    <w:spacing w:after="40"/>
+                    <w:spacing w:after="0"/>
                   </w:pPr>
                   <w:r>
                     <w:rPr>
@@ -4569,7 +4569,7 @@
                 </w:tcPr>
                 <w:p>
                   <w:pPr>
-                    <w:spacing w:after="40"/>
+                    <w:spacing w:after="0"/>
                   </w:pPr>
                   <w:r>
                     <w:rPr>
@@ -4598,7 +4598,7 @@
                 </w:tcPr>
                 <w:p>
                   <w:pPr>
-                    <w:spacing w:after="40"/>
+                    <w:spacing w:after="0"/>
                   </w:pPr>
                   <w:r>
                     <w:rPr>
@@ -4629,7 +4629,7 @@
                 </w:tcPr>
                 <w:p>
                   <w:pPr>
-                    <w:spacing w:after="40"/>
+                    <w:spacing w:after="0"/>
                     <w:jc w:val="right"/>
                   </w:pPr>
                   <w:r>
@@ -4659,7 +4659,7 @@
                 </w:tcPr>
                 <w:p>
                   <w:pPr>
-                    <w:spacing w:after="40"/>
+                    <w:spacing w:after="0"/>
                   </w:pPr>
                   <w:r>
                     <w:rPr>
@@ -4688,7 +4688,7 @@
                 </w:tcPr>
                 <w:p>
                   <w:pPr>
-                    <w:spacing w:after="40"/>
+                    <w:spacing w:after="0"/>
                   </w:pPr>
                   <w:r>
                     <w:rPr>
@@ -4717,7 +4717,7 @@
                 </w:tcPr>
                 <w:p>
                   <w:pPr>
-                    <w:spacing w:after="40"/>
+                    <w:spacing w:after="0"/>
                   </w:pPr>
                   <w:r>
                     <w:rPr>
@@ -4748,7 +4748,7 @@
                 </w:tcPr>
                 <w:p>
                   <w:pPr>
-                    <w:spacing w:after="40"/>
+                    <w:spacing w:after="0"/>
                     <w:jc w:val="right"/>
                   </w:pPr>
                   <w:r>
@@ -4778,7 +4778,7 @@
                 </w:tcPr>
                 <w:p>
                   <w:pPr>
-                    <w:spacing w:after="40"/>
+                    <w:spacing w:after="0"/>
                   </w:pPr>
                   <w:r>
                     <w:rPr>
@@ -4807,7 +4807,7 @@
                 </w:tcPr>
                 <w:p>
                   <w:pPr>
-                    <w:spacing w:after="40"/>
+                    <w:spacing w:after="0"/>
                   </w:pPr>
                   <w:r>
                     <w:rPr>
@@ -4836,7 +4836,7 @@
                 </w:tcPr>
                 <w:p>
                   <w:pPr>
-                    <w:spacing w:after="40"/>
+                    <w:spacing w:after="0"/>
                   </w:pPr>
                   <w:r>
                     <w:rPr>
@@ -4867,7 +4867,7 @@
                 </w:tcPr>
                 <w:p>
                   <w:pPr>
-                    <w:spacing w:after="40"/>
+                    <w:spacing w:after="0"/>
                     <w:jc w:val="right"/>
                   </w:pPr>
                   <w:r>
@@ -4897,7 +4897,7 @@
                 </w:tcPr>
                 <w:p>
                   <w:pPr>
-                    <w:spacing w:after="40"/>
+                    <w:spacing w:after="0"/>
                   </w:pPr>
                   <w:r>
                     <w:rPr>
@@ -4926,7 +4926,7 @@
                 </w:tcPr>
                 <w:p>
                   <w:pPr>
-                    <w:spacing w:after="40"/>
+                    <w:spacing w:after="0"/>
                   </w:pPr>
                   <w:r>
                     <w:rPr>
@@ -4955,7 +4955,7 @@
                 </w:tcPr>
                 <w:p>
                   <w:pPr>
-                    <w:spacing w:after="40"/>
+                    <w:spacing w:after="0"/>
                   </w:pPr>
                   <w:r>
                     <w:rPr>
@@ -4986,7 +4986,7 @@
                 </w:tcPr>
                 <w:p>
                   <w:pPr>
-                    <w:spacing w:after="40"/>
+                    <w:spacing w:after="0"/>
                     <w:jc w:val="right"/>
                   </w:pPr>
                   <w:r>
@@ -5016,7 +5016,7 @@
                 </w:tcPr>
                 <w:p>
                   <w:pPr>
-                    <w:spacing w:after="40"/>
+                    <w:spacing w:after="0"/>
                   </w:pPr>
                   <w:r>
                     <w:rPr>
@@ -5045,7 +5045,7 @@
                 </w:tcPr>
                 <w:p>
                   <w:pPr>
-                    <w:spacing w:after="40"/>
+                    <w:spacing w:after="0"/>
                   </w:pPr>
                   <w:r>
                     <w:rPr>
@@ -5074,7 +5074,7 @@
                 </w:tcPr>
                 <w:p>
                   <w:pPr>
-                    <w:spacing w:after="40"/>
+                    <w:spacing w:after="0"/>
                   </w:pPr>
                   <w:r>
                     <w:rPr>
@@ -5098,7 +5098,7 @@
     </w:tbl>
     <w:sectPr>
       <w:pgSz w:w="12240" w:h="15840" w:orient="portrait"/>
-      <w:pgMar w:top="720" w:right="720" w:bottom="720" w:left="720" w:header="708" w:footer="708" w:gutter="0"/>
+      <w:pgMar w:top="576" w:right="720" w:bottom="576" w:left="720" w:header="708" w:footer="708" w:gutter="0"/>
       <w:pgNumType/>
       <w:docGrid w:linePitch="360"/>
     </w:sectPr>

</xml_diff>